<commit_message>
Docs: add maxUnavailable tip for faster MCP rollout
</commit_message>
<xml_diff>
--- a/docs/openshift-gpu-rdma-setup.docx
+++ b/docs/openshift-gpu-rdma-setup.docx
@@ -10357,7 +10357,7 @@
         <w:t xml:space="preserve"> </w:t>
       </w:r>
       <w:r>
-        <w:t xml:space="preserve">This triggers a rolling reboot of all GPU nodes (one at a time). Wait for the MachineConfigPool to show</w:t>
+        <w:t xml:space="preserve">This triggers a rolling reboot of all GPU nodes. Wait for the MachineConfigPool to show</w:t>
       </w:r>
       <w:r>
         <w:t xml:space="preserve"> </w:t>
@@ -10373,6 +10373,61 @@
       </w:r>
       <w:r>
         <w:t xml:space="preserve">before proceeding.</w:t>
+      </w:r>
+    </w:p>
+    <w:p>
+      <w:pPr>
+        <w:pStyle w:val="FirstParagraph"/>
+      </w:pPr>
+      <w:r>
+        <w:t xml:space="preserve">To speed up the rollout, increase parallel updates (default is 1 node at a time):</w:t>
+      </w:r>
+    </w:p>
+    <w:p>
+      <w:pPr>
+        <w:pStyle w:val="SourceCode"/>
+      </w:pPr>
+      <w:r>
+        <w:rPr>
+          <w:rStyle w:val="ExtensionTok"/>
+        </w:rPr>
+        <w:t xml:space="preserve">oc</w:t>
+      </w:r>
+      <w:r>
+        <w:rPr>
+          <w:rStyle w:val="NormalTok"/>
+        </w:rPr>
+        <w:t xml:space="preserve"> patch mcp gdr </w:t>
+      </w:r>
+      <w:r>
+        <w:rPr>
+          <w:rStyle w:val="AttributeTok"/>
+        </w:rPr>
+        <w:t xml:space="preserve">--type</w:t>
+      </w:r>
+      <w:r>
+        <w:rPr>
+          <w:rStyle w:val="NormalTok"/>
+        </w:rPr>
+        <w:t xml:space="preserve"> merge </w:t>
+      </w:r>
+      <w:r>
+        <w:rPr>
+          <w:rStyle w:val="AttributeTok"/>
+        </w:rPr>
+        <w:t xml:space="preserve">-p</w:t>
+      </w:r>
+      <w:r>
+        <w:rPr>
+          <w:rStyle w:val="NormalTok"/>
+        </w:rPr>
+        <w:t xml:space="preserve"> </w:t>
+      </w:r>
+      <w:r>
+        <w:rPr>
+          <w:rStyle w:val="StringTok"/>
+        </w:rPr>
+        <w:t xml:space="preserve">'{"spec":{"maxUnavailable":4}}'</w:t>
       </w:r>
     </w:p>
     <w:p>

</xml_diff>

<commit_message>
Docs: GPU operator 26.3.0, enable gdrcopy, add gdrcopy to key settings
</commit_message>
<xml_diff>
--- a/docs/openshift-gpu-rdma-setup.docx
+++ b/docs/openshift-gpu-rdma-setup.docx
@@ -7508,7 +7508,7 @@
         <w:rPr>
           <w:rStyle w:val="CharTok"/>
         </w:rPr>
-        <w:t xml:space="preserve">false</w:t>
+        <w:t xml:space="preserve">true</w:t>
       </w:r>
       <w:r>
         <w:br/>
@@ -7713,6 +7713,27 @@
       </w:r>
       <w:r>
         <w:t xml:space="preserve">— enables Container Device Interface for GPU passthrough</w:t>
+      </w:r>
+      <w:r>
+        <w:t xml:space="preserve"> </w:t>
+      </w:r>
+      <w:r>
+        <w:t xml:space="preserve">-</w:t>
+      </w:r>
+      <w:r>
+        <w:t xml:space="preserve"> </w:t>
+      </w:r>
+      <w:r>
+        <w:rPr>
+          <w:rStyle w:val="VerbatimChar"/>
+        </w:rPr>
+        <w:t xml:space="preserve">gdrcopy.enabled: true</w:t>
+      </w:r>
+      <w:r>
+        <w:t xml:space="preserve"> </w:t>
+      </w:r>
+      <w:r>
+        <w:t xml:space="preserve">— enables GPU Direct Copy for low-latency GPU memory transfers (required for optimal RDMA performance)</w:t>
       </w:r>
     </w:p>
     <w:bookmarkEnd w:id="19"/>
@@ -32100,7 +32121,7 @@
               <w:pStyle w:val="Compact"/>
             </w:pPr>
             <w:r>
-              <w:t xml:space="preserve">25.10.1</w:t>
+              <w:t xml:space="preserve">26.3.0</w:t>
             </w:r>
           </w:p>
         </w:tc>

</xml_diff>

<commit_message>
Docs: add Gateway/Istio version details — OpenShift Service Mesh vs upstream Istio 1.28.x
</commit_message>
<xml_diff>
--- a/docs/openshift-gpu-rdma-setup.docx
+++ b/docs/openshift-gpu-rdma-setup.docx
@@ -28030,8 +28030,9 @@
         <w:tblLook w:firstRow="1" w:lastRow="0" w:firstColumn="0" w:lastColumn="0" w:noHBand="0" w:noVBand="0" w:val="0020"/>
       </w:tblPr>
       <w:tblGrid>
-        <w:gridCol w:w="4356"/>
-        <w:gridCol w:w="3564"/>
+        <w:gridCol w:w="3226"/>
+        <w:gridCol w:w="2640"/>
+        <w:gridCol w:w="2053"/>
       </w:tblGrid>
       <w:tr>
         <w:trPr>
@@ -28059,6 +28060,17 @@
             </w:r>
           </w:p>
         </w:tc>
+        <w:tc>
+          <w:tcPr/>
+          <w:p>
+            <w:pPr>
+              <w:pStyle w:val="Compact"/>
+            </w:pPr>
+            <w:r>
+              <w:t xml:space="preserve">Notes</w:t>
+            </w:r>
+          </w:p>
+        </w:tc>
       </w:tr>
       <w:tr>
         <w:tc>
@@ -28083,8 +28095,6 @@
             </w:r>
           </w:p>
         </w:tc>
-      </w:tr>
-      <w:tr>
         <w:tc>
           <w:tcPr/>
           <w:p>
@@ -28092,18 +28102,7 @@
               <w:pStyle w:val="Compact"/>
             </w:pPr>
             <w:r>
-              <w:t xml:space="preserve">Kubernetes</w:t>
-            </w:r>
-          </w:p>
-        </w:tc>
-        <w:tc>
-          <w:tcPr/>
-          <w:p>
-            <w:pPr>
-              <w:pStyle w:val="Compact"/>
-            </w:pPr>
-            <w:r>
-              <w:t xml:space="preserve">1.34.8</w:t>
+              <w:t xml:space="preserve">Kubernetes 1.34.8</w:t>
             </w:r>
           </w:p>
         </w:tc>
@@ -28131,6 +28130,14 @@
             </w:r>
           </w:p>
         </w:tc>
+        <w:tc>
+          <w:tcPr/>
+          <w:p>
+            <w:pPr>
+              <w:pStyle w:val="Compact"/>
+            </w:pPr>
+          </w:p>
+        </w:tc>
       </w:tr>
       <w:tr>
         <w:tc>
@@ -28155,8 +28162,6 @@
             </w:r>
           </w:p>
         </w:tc>
-      </w:tr>
-      <w:tr>
         <w:tc>
           <w:tcPr/>
           <w:p>
@@ -28164,18 +28169,7 @@
               <w:pStyle w:val="Compact"/>
             </w:pPr>
             <w:r>
-              <w:t xml:space="preserve">DOCA/MOFED Driver</w:t>
-            </w:r>
-          </w:p>
-        </w:tc>
-        <w:tc>
-          <w:tcPr/>
-          <w:p>
-            <w:pPr>
-              <w:pStyle w:val="Compact"/>
-            </w:pPr>
-            <w:r>
-              <w:t xml:space="preserve">doca3.3.0-26.01-1.0.0.0-0</w:t>
+              <w:t xml:space="preserve">DOCA/MOFED doca3.3.0-26.01-1.0.0.0-0</w:t>
             </w:r>
           </w:p>
         </w:tc>
@@ -28203,8 +28197,6 @@
             </w:r>
           </w:p>
         </w:tc>
-      </w:tr>
-      <w:tr>
         <w:tc>
           <w:tcPr/>
           <w:p>
@@ -28212,18 +28204,7 @@
               <w:pStyle w:val="Compact"/>
             </w:pPr>
             <w:r>
-              <w:t xml:space="preserve">CUDA Driver</w:t>
-            </w:r>
-          </w:p>
-        </w:tc>
-        <w:tc>
-          <w:tcPr/>
-          <w:p>
-            <w:pPr>
-              <w:pStyle w:val="Compact"/>
-            </w:pPr>
-            <w:r>
-              <w:t xml:space="preserve">580.105</w:t>
+              <w:t xml:space="preserve">CUDA Driver 580.105, gdrcopy enabled</w:t>
             </w:r>
           </w:p>
         </w:tc>
@@ -28251,6 +28232,14 @@
             </w:r>
           </w:p>
         </w:tc>
+        <w:tc>
+          <w:tcPr/>
+          <w:p>
+            <w:pPr>
+              <w:pStyle w:val="Compact"/>
+            </w:pPr>
+          </w:p>
+        </w:tc>
       </w:tr>
       <w:tr>
         <w:tc>
@@ -28275,6 +28264,14 @@
             </w:r>
           </w:p>
         </w:tc>
+        <w:tc>
+          <w:tcPr/>
+          <w:p>
+            <w:pPr>
+              <w:pStyle w:val="Compact"/>
+            </w:pPr>
+          </w:p>
+        </w:tc>
       </w:tr>
       <w:tr>
         <w:tc>
@@ -28285,6 +28282,17 @@
             </w:pPr>
             <w:r>
               <w:t xml:space="preserve">DRA GPU-NIC Admission Webhook</w:t>
+            </w:r>
+          </w:p>
+        </w:tc>
+        <w:tc>
+          <w:tcPr/>
+          <w:p>
+            <w:pPr>
+              <w:pStyle w:val="Compact"/>
+            </w:pPr>
+            <w:r>
+              <w:t xml:space="preserve">latest</w:t>
             </w:r>
           </w:p>
         </w:tc>
@@ -28313,6 +28321,80 @@
               <w:pStyle w:val="Compact"/>
             </w:pPr>
             <w:r>
+              <w:t xml:space="preserve">Gateway / Istio</w:t>
+            </w:r>
+          </w:p>
+        </w:tc>
+        <w:tc>
+          <w:tcPr/>
+          <w:p>
+            <w:pPr>
+              <w:pStyle w:val="Compact"/>
+            </w:pPr>
+            <w:r>
+              <w:t xml:space="preserve">OpenShift Service Mesh 3.3.4</w:t>
+            </w:r>
+          </w:p>
+        </w:tc>
+        <w:tc>
+          <w:tcPr/>
+          <w:p>
+            <w:pPr>
+              <w:pStyle w:val="Compact"/>
+            </w:pPr>
+            <w:r>
+              <w:t xml:space="preserve">Uses</w:t>
+            </w:r>
+            <w:r>
+              <w:t xml:space="preserve"> </w:t>
+            </w:r>
+            <w:r>
+              <w:rPr>
+                <w:rStyle w:val="VerbatimChar"/>
+              </w:rPr>
+              <w:t xml:space="preserve">data-science-gateway-class</w:t>
+            </w:r>
+            <w:r>
+              <w:t xml:space="preserve"> </w:t>
+            </w:r>
+            <w:r>
+              <w:t xml:space="preserve">(OpenShift) or</w:t>
+            </w:r>
+            <w:r>
+              <w:t xml:space="preserve"> </w:t>
+            </w:r>
+            <w:r>
+              <w:rPr>
+                <w:rStyle w:val="VerbatimChar"/>
+              </w:rPr>
+              <w:t xml:space="preserve">istio</w:t>
+            </w:r>
+            <w:r>
+              <w:t xml:space="preserve"> </w:t>
+            </w:r>
+            <w:r>
+              <w:t xml:space="preserve">(upstream). llm-d upstream ships Istio 1.28.x with</w:t>
+            </w:r>
+            <w:r>
+              <w:t xml:space="preserve"> </w:t>
+            </w:r>
+            <w:r>
+              <w:rPr>
+                <w:rStyle w:val="VerbatimChar"/>
+              </w:rPr>
+              <w:t xml:space="preserve">ENABLE_GATEWAY_API_INFERENCE_EXTENSION=true</w:t>
+            </w:r>
+          </w:p>
+        </w:tc>
+      </w:tr>
+      <w:tr>
+        <w:tc>
+          <w:tcPr/>
+          <w:p>
+            <w:pPr>
+              <w:pStyle w:val="Compact"/>
+            </w:pPr>
+            <w:r>
               <w:t xml:space="preserve">SR-IOV Network Operator</w:t>
             </w:r>
           </w:p>
@@ -28326,6 +28408,14 @@
             <w:r>
               <w:t xml:space="preserve">4.21.0</w:t>
             </w:r>
+          </w:p>
+        </w:tc>
+        <w:tc>
+          <w:tcPr/>
+          <w:p>
+            <w:pPr>
+              <w:pStyle w:val="Compact"/>
+            </w:pPr>
           </w:p>
         </w:tc>
       </w:tr>
@@ -28348,7 +28438,30 @@
               <w:pStyle w:val="Compact"/>
             </w:pPr>
             <w:r>
-              <w:t xml:space="preserve">0.8.0 (upstream, installed via Helm)</w:t>
+              <w:t xml:space="preserve">0.8.0</w:t>
+            </w:r>
+          </w:p>
+        </w:tc>
+        <w:tc>
+          <w:tcPr/>
+          <w:p>
+            <w:pPr>
+              <w:pStyle w:val="Compact"/>
+            </w:pPr>
+            <w:r>
+              <w:t xml:space="preserve">Upstream, installed via Helm (Red Hat build v1.0.0 lacks</w:t>
+            </w:r>
+            <w:r>
+              <w:t xml:space="preserve"> </w:t>
+            </w:r>
+            <w:r>
+              <w:rPr>
+                <w:rStyle w:val="VerbatimChar"/>
+              </w:rPr>
+              <w:t xml:space="preserve">volumeClaimTemplates</w:t>
+            </w:r>
+            <w:r>
+              <w:t xml:space="preserve">)</w:t>
             </w:r>
           </w:p>
         </w:tc>
@@ -28376,6 +28489,14 @@
             </w:r>
           </w:p>
         </w:tc>
+        <w:tc>
+          <w:tcPr/>
+          <w:p>
+            <w:pPr>
+              <w:pStyle w:val="Compact"/>
+            </w:pPr>
+          </w:p>
+        </w:tc>
       </w:tr>
       <w:tr>
         <w:tc>
@@ -28398,6 +28519,14 @@
             <w:r>
               <w:t xml:space="preserve">0.0.9</w:t>
             </w:r>
+          </w:p>
+        </w:tc>
+        <w:tc>
+          <w:tcPr/>
+          <w:p>
+            <w:pPr>
+              <w:pStyle w:val="Compact"/>
+            </w:pPr>
           </w:p>
         </w:tc>
       </w:tr>

</xml_diff>